<commit_message>
Add grade 7 lesson 1 sheets (linear function) in PDF and Word
- задачи: the two scanned problem sheets retyped as text (intro problem
  а)–и), problems 1–8 with the piecewise function set as a braced
  system, and the two olympiad problems); title fixed to «Линейная
  функция» to match the content
- теория: the six colour graphs redrawn in black and white on a square
  grid, captions and text updated to drop colour references

Also refresh the grade 9 Word files: a word joiner after "|" in
formulas stops Word from breaking a line inside |a| or |y + 2|.

Co-Authored-By: Claude Opus 5.5 <noreply@anthropic.com>
Claude-Session: https://claude.ai/code/session_01MFvJiyzmhhUbmeDcqURDMG
</commit_message>
<xml_diff>
--- a/fundament/Математика_9_класс_занятие_1_теория.docx
+++ b/fundament/Математика_9_класс_занятие_1_теория.docx
@@ -189,7 +189,7 @@
         <w:t xml:space="preserve">ось симметрии</w:t>
       </w:r>
       <w:r>
-        <w:t xml:space="preserve">. Если |</w:t>
+        <w:t xml:space="preserve">. Если |⁠</w:t>
       </w:r>
       <w:r>
         <w:rPr>
@@ -199,7 +199,7 @@
         <w:t xml:space="preserve">a</w:t>
       </w:r>
       <w:r>
-        <w:t xml:space="preserve">| &gt; 1, парабола уже графика </w:t>
+        <w:t xml:space="preserve">|⁠ &gt; 1, парабола уже графика </w:t>
       </w:r>
       <w:r>
         <w:rPr>
@@ -225,7 +225,7 @@
         <w:t xml:space="preserve">2</w:t>
       </w:r>
       <w:r>
-        <w:t xml:space="preserve">; если 0 &lt; |</w:t>
+        <w:t xml:space="preserve">; если 0 &lt; |⁠</w:t>
       </w:r>
       <w:r>
         <w:rPr>
@@ -235,7 +235,7 @@
         <w:t xml:space="preserve">a</w:t>
       </w:r>
       <w:r>
-        <w:t xml:space="preserve">| &lt; 1 — шире.</w:t>
+        <w:t xml:space="preserve">|⁠ &lt; 1 — шире.</w:t>
       </w:r>
     </w:p>
     <w:tbl>
@@ -2650,7 +2650,7 @@
         <w:t xml:space="preserve">y</w:t>
       </w:r>
       <w:r>
-        <w:t xml:space="preserve"> = −2 равно |</w:t>
+        <w:t xml:space="preserve"> = −2 равно |⁠</w:t>
       </w:r>
       <w:r>
         <w:rPr>
@@ -2660,7 +2660,7 @@
         <w:t xml:space="preserve">y</w:t>
       </w:r>
       <w:r>
-        <w:t xml:space="preserve"> + 2|. Приравняем их и возведём обе части в квадрат: </w:t>
+        <w:t xml:space="preserve"> + 2|⁠. Приравняем их и возведём обе части в квадрат: </w:t>
       </w:r>
       <w:r>
         <w:rPr>
@@ -4592,6 +4592,7 @@
     </w:rPrDefault>
     <w:pPrDefault>
       <w:pPr>
+        <w:widowControl/>
         <w:spacing w:after="0" w:before="0" w:line="276" w:lineRule="exact"/>
       </w:pPr>
     </w:pPrDefault>

</xml_diff>